<commit_message>
feat: text 2nd technique (zero-width), metadata CLI/GUI polish, 17-slide presentation, docs 60/60
</commit_message>
<xml_diff>
--- a/StegoNexus_Documentation.docx
+++ b/StegoNexus_Documentation.docx
@@ -260,7 +260,7 @@
                 <w:color w:val="1F1F1F"/>
                 <w:sz w:val="20"/>
               </w:rPr>
-              <w:t>نص (LSB+Key) · صورة (Steghide/CyberHide) · صوت (4 تقنيات) · فيديو (3 تقنيات) · شبكة (3 قنوات) · برامج ضارة (كشف/تحليل)</w:t>
+              <w:t>نص (تقنيتان: LSB+Key و Zero-Width) · صورة (Steghide/CyberHide) · صوت (4 تقنيات) · فيديو (3 تقنيات) · شبكة (3 قنوات) · برامج ضارة (كشف/تحليل)</w:t>
             </w:r>
           </w:p>
         </w:tc>
@@ -1040,7 +1040,7 @@
                 <w:color w:val="1F1F1F"/>
                 <w:sz w:val="20"/>
               </w:rPr>
-              <w:t>نعم: الصوت 4 تقنيات · الفيديو 3 · الشبكة 3 · الصورة 2 (+ حماية كلٌّ بالمفتاح)</w:t>
+              <w:t>نعم: النص 2 · الصورة 2 · الصوت 4 · الفيديو 3 · الشبكة 3 (+ حماية كلٌّ بالمفتاح)</w:t>
             </w:r>
           </w:p>
         </w:tc>
@@ -1828,7 +1828,7 @@
           <w:color w:val="008050"/>
           <w:sz w:val="30"/>
         </w:rPr>
-        <w:t>04 — Text Hiding: LSB with Key</w:t>
+        <w:t>04 — Text Hiding (تقنيتان): LSB with Key + Zero-Width</w:t>
       </w:r>
     </w:p>
     <w:p>
@@ -1843,7 +1843,9 @@
           <w:color w:val="1F1F1F"/>
           <w:sz w:val="22"/>
         </w:rPr>
-        <w:t>التنفيذ: Cover + Secret + Key → تشفير السر بتيار مفتاح (PBKDF2-HMAC-SHA256، 100k جولة) وهي موجودة في ترويسة تنسيق، ثم إخفاء البتات في LSB لرموز يونيكود عبر تبديل مواضع مبني على المفتاح. الاستخراج يعكس العملية بنفس المفتاح؛ المفتاح الخاطئ يُرفض.</w:t>
+        <w:t>تقنية 1 (LSB): Cover + Secret + Key → تشفير السر بتيار مفتاح (PBKDF2-HMAC-SHA256، 100k جولة) وهي موجودة في ترويسة تنسيق، ثم إخفاء البتات في LSB لرموز يونيكود عبر تبديل مواضع مبني على المفتاح؛ الاستخراج يعكس العملية بنفس المفتاح والمفتاح الخاطئ يُرفض.</w:t>
+        <w:br/>
+        <w:t>تقنية 2 (Zero-Width): كل بتّين يُرمَّزان بأحد أربعة أحرف غير مرئية (U+200B / U+200C / U+200D / U+FEFF) تُوزَّع داخل النص بتباعد مفتاحي؛ النص يبدو طبيعياً تماماً والاستخراج يزيلها ويعيد فك التشفير. إضافة إلى ذلك يوجد أمر text-inspect يكشف القناة بدون المفتاح.</w:t>
       </w:r>
     </w:p>
     <w:p>
@@ -2199,6 +2201,62 @@
                 <w:sz w:val="20"/>
               </w:rPr>
               <w:t>Stego Text + Key → LSB Decoding → Original Secret</w:t>
+            </w:r>
+          </w:p>
+        </w:tc>
+      </w:tr>
+      <w:tr>
+        <w:tc>
+          <w:tcPr>
+            <w:tcW w:type="dxa" w:w="1728"/>
+          </w:tcPr>
+          <w:p>
+            <w:r/>
+            <w:r>
+              <w:rPr>
+                <w:rFonts w:ascii="Calibri" w:hAnsi="Calibri" w:cs="Calibri"/>
+                <w:b w:val="0"/>
+                <w:i w:val="0"/>
+                <w:color w:val="1F1F1F"/>
+                <w:sz w:val="20"/>
+              </w:rPr>
+              <w:t>Text Zero-Width</w:t>
+            </w:r>
+          </w:p>
+        </w:tc>
+        <w:tc>
+          <w:tcPr>
+            <w:tcW w:type="dxa" w:w="4032"/>
+          </w:tcPr>
+          <w:p>
+            <w:r/>
+            <w:r>
+              <w:rPr>
+                <w:rFonts w:ascii="Calibri" w:hAnsi="Calibri" w:cs="Calibri"/>
+                <w:b w:val="0"/>
+                <w:i w:val="0"/>
+                <w:color w:val="1F1F1F"/>
+                <w:sz w:val="20"/>
+              </w:rPr>
+              <w:t>Cover Text + Secret + Key → 2-bit → invisible chars → Stego Text</w:t>
+            </w:r>
+          </w:p>
+        </w:tc>
+        <w:tc>
+          <w:tcPr>
+            <w:tcW w:type="dxa" w:w="3600"/>
+          </w:tcPr>
+          <w:p>
+            <w:r/>
+            <w:r>
+              <w:rPr>
+                <w:rFonts w:ascii="Calibri" w:hAnsi="Calibri" w:cs="Calibri"/>
+                <w:b w:val="0"/>
+                <w:i w:val="0"/>
+                <w:color w:val="1F1F1F"/>
+                <w:sz w:val="20"/>
+              </w:rPr>
+              <w:t>Stego Text + Key → strip chars + XOR → Original Secret</w:t>
             </w:r>
           </w:p>
         </w:tc>
@@ -2844,7 +2902,7 @@
           <w:color w:val="1F1F1F"/>
           <w:sz w:val="21"/>
         </w:rPr>
-        <w:t>python run_cli.py text hide cover.txt --message s.txt --key K  ثم  text reveal</w:t>
+        <w:t>python run_cli.py text hide cover.txt --message s.txt --key K  ثم  text reveal  (اختر --technique lsb/zerowidth) + text-inspect</w:t>
       </w:r>
     </w:p>
     <w:p>

</xml_diff>